<commit_message>
tcc: adicionar link público do repositório no Apêndice A
Acrescenta no Apêndice A — Detalhes da validação — a referência ao
repositório público do código-fonte em formato ABNT (NBR 6023:2018):
"Disponível em: https://github.com/brunomelor/tcc-comparador-textos.
Acesso em: 17 maio 2026."

Justificativa: a entrega final pelo AVA da UNINTER aceita apenas
arquivos .docx/.doc/.odt/.rtf — não permite anexar o código-fonte
separadamente. O link no Apêndice A garante que o orientador possa
inspecionar o sistema descrito no artigo.
</commit_message>
<xml_diff>
--- a/tcc/docs/tcc-bruno-lorencatto.docx
+++ b/tcc/docs/tcc-bruno-lorencatto.docx
@@ -5380,6 +5380,63 @@
           <w:rFonts w:ascii="Arial" w:hAnsi="Arial"/>
           <w:sz w:val="24"/>
         </w:rPr>
+        <w:t xml:space="preserve">O código-fonte completo do sistema — incluindo o </w:t>
+      </w:r>
+      <w:r>
+        <w:rPr>
+          <w:rFonts w:ascii="Arial" w:hAnsi="Arial"/>
+          <w:i/>
+          <w:sz w:val="24"/>
+        </w:rPr>
+        <w:t>back-end</w:t>
+      </w:r>
+      <w:r>
+        <w:rPr>
+          <w:rFonts w:ascii="Arial" w:hAnsi="Arial"/>
+          <w:sz w:val="24"/>
+        </w:rPr>
+        <w:t xml:space="preserve"> (FastAPI, NLTK e scikit-learn), o </w:t>
+      </w:r>
+      <w:r>
+        <w:rPr>
+          <w:rFonts w:ascii="Arial" w:hAnsi="Arial"/>
+          <w:i/>
+          <w:sz w:val="24"/>
+        </w:rPr>
+        <w:t>front-end</w:t>
+      </w:r>
+      <w:r>
+        <w:rPr>
+          <w:rFonts w:ascii="Arial" w:hAnsi="Arial"/>
+          <w:sz w:val="24"/>
+        </w:rPr>
+        <w:t xml:space="preserve"> (React, TypeScript e Tailwind CSS) e o </w:t>
+      </w:r>
+      <w:r>
+        <w:rPr>
+          <w:rFonts w:ascii="Arial" w:hAnsi="Arial"/>
+          <w:i/>
+          <w:sz w:val="24"/>
+        </w:rPr>
+        <w:t>script</w:t>
+      </w:r>
+      <w:r>
+        <w:rPr>
+          <w:rFonts w:ascii="Arial" w:hAnsi="Arial"/>
+          <w:sz w:val="24"/>
+        </w:rPr>
+        <w:t xml:space="preserve"> de validação descrito nesta seção — está disponível publicamente em: https://github.com/brunomelor/tcc-comparador-textos. Acesso em: 17 maio 2026.</w:t>
+      </w:r>
+    </w:p>
+    <w:p>
+      <w:pPr>
+        <w:jc w:val="both"/>
+      </w:pPr>
+      <w:r>
+        <w:rPr>
+          <w:rFonts w:ascii="Arial" w:hAnsi="Arial"/>
+          <w:sz w:val="24"/>
+        </w:rPr>
         <w:t>O Quadro 5 sumariza, a título ilustrativo, três pares representativos do experimento, com seus escores humanos normalizados e os escores calculados pelo sistema.</w:t>
       </w:r>
     </w:p>

</xml_diff>